<commit_message>
Finalize report evidence and evaluation outputs
</commit_message>
<xml_diff>
--- a/CM3070_full_report_draft.docx
+++ b/CM3070_full_report_draft.docx
@@ -96,7 +96,16 @@
         <w:t>Supervisor:</w:t>
       </w:r>
       <w:r>
-        <w:t xml:space="preserve"> Mr. Chew Jee Loong</w:t>
+        <w:t xml:space="preserve"> Mr. Chew Jee Loong </w:t>
+      </w:r>
+      <w:r>
+        <w:rPr>
+          <w:b/>
+        </w:rPr>
+        <w:t>Public Code Repository:</w:t>
+      </w:r>
+      <w:r>
+        <w:t xml:space="preserve"> https://github.com/kohjunhao/alfred-crypto-ai-companion</w:t>
       </w:r>
     </w:p>
     <w:p>
@@ -188,7 +197,16 @@
     </w:p>
     <w:p>
       <w:r>
-        <w:t>The project draws inspiration from the financial assistant template discussed in earlier University of London coursework, but adapts it to a crypto-specific setting. The focus is not on automated trading or portfolio execution. Instead, Alfred is an educational and informational assistant that helps users access live market data more safely and clearly.</w:t>
+        <w:t xml:space="preserve">The project draws inspiration from </w:t>
+      </w:r>
+      <w:r>
+        <w:rPr>
+          <w:b/>
+        </w:rPr>
+        <w:t>CM3020 Artificial Intelligence, Section 4.2, Project Idea 2: Financial Advisor Bot</w:t>
+      </w:r>
+      <w:r>
+        <w:t>, but adapts that template to a crypto-specific setting. The focus is not on automated trading or portfolio execution. Instead, Alfred is an educational and informational assistant that helps users access live market data more safely and clearly.</w:t>
       </w:r>
     </w:p>
     <w:p>
@@ -481,6 +499,11 @@
     </w:p>
     <w:p>
       <w:r>
+        <w:t>The literature base combines academic papers, recent surveys, official technical reports, and a small number of industry sources. Where non-academic sources are used, such as TRM Labs or product pages for existing tools, they are treated as market-context evidence rather than the main proof for technical claims. The core technical arguments in this chapter rely mainly on peer-reviewed or preprint research and official model reports.</w:t>
+      </w:r>
+    </w:p>
+    <w:p>
+      <w:r>
         <w:t>Taken together, these themes explain why Alfred is designed as a constrained Agentic RAG assistant rather than a general-purpose chatbot or execution agent.</w:t>
       </w:r>
     </w:p>
@@ -557,7 +580,7 @@
     </w:p>
     <w:p>
       <w:r>
-        <w:t>Sert (2025) discusses factual hallucination in financial contexts, where models can generate numbers that sound plausible but are not grounded in current reality. This type of failure is dangerous because it is often not obvious to the user. A hallucinated price may still look reasonable on first reading, which makes it more risky than an obviously broken answer.</w:t>
+        <w:t>Lee et al. (2024), in a recent survey of Large Language Models in finance, identify hallucination, privacy, and efficiency as continuing obstacles to safe financial use. Sert (2025) discusses factual hallucination in financial contexts, where models can generate numbers that sound plausible but are not grounded in current reality. This type of failure is dangerous because it is often not obvious to the user. A hallucinated price may still look reasonable on first reading, which makes it more risky than an obviously broken answer.</w:t>
       </w:r>
     </w:p>
     <w:p>
@@ -705,7 +728,7 @@
     </w:p>
     <w:p>
       <w:r>
-        <w:t>This design is important for two reasons. First, it matches the time-sensitive nature of the domain. Second, it reduces the burden on the LLM. The model does not need to choose between many ambiguous sources at generation time, because the routing and retrieval decisions have already been made by the backend.</w:t>
+        <w:t>This design is important for two reasons. First, it matches the time-sensitive nature of the domain. Second, it reduces the burden on the LLM. The model does not need to choose between many ambiguous sources at generation time, because the routing and retrieval decisions have already been made by the backend. Recent RAG surveys also support this direction. Sharma (2025) argues that modern RAG systems must balance grounding fidelity, efficiency, and robustness. That trade-off is directly relevant to Alfred, because the system needs both factual grounding and practical response speed rather than maximum model creativity.</w:t>
       </w:r>
     </w:p>
     <w:p>
@@ -1433,6 +1456,20 @@
       </w:r>
     </w:p>
     <w:p>
+      <w:r>
+        <w:t xml:space="preserve">Llama 3 was selected because it is a strong open-weight general model with mature Ollama support and a well-documented technical report (Grattafiori et al., 2024). However, the reviewer's concern that this choice should be justified is valid. For that reason, the final evaluation also includes a comparison against </w:t>
+      </w:r>
+      <w:r>
+        <w:rPr>
+          <w:b/>
+        </w:rPr>
+        <w:t>`qwen2.5:3b`</w:t>
+      </w:r>
+      <w:r>
+        <w:t xml:space="preserve"> rather than treating Llama 3 as correct by assumption.</w:t>
+      </w:r>
+    </w:p>
+    <w:p>
       <w:pPr>
         <w:pStyle w:val="Heading3"/>
       </w:pPr>
@@ -2650,7 +2687,330 @@
         <w:pStyle w:val="Heading3"/>
       </w:pPr>
       <w:r>
-        <w:t>5.2.4 Edge Cases and Failure Handling</w:t>
+        <w:t xml:space="preserve">5.2.4 LLM Comparison: </w:t>
+      </w:r>
+      <w:r>
+        <w:rPr>
+          <w:rFonts w:ascii="Courier New" w:hAnsi="Courier New"/>
+        </w:rPr>
+        <w:t>llama3</w:t>
+      </w:r>
+      <w:r>
+        <w:t xml:space="preserve"> vs </w:t>
+      </w:r>
+      <w:r>
+        <w:rPr>
+          <w:rFonts w:ascii="Courier New" w:hAnsi="Courier New"/>
+        </w:rPr>
+        <w:t>qwen2.5:3b</w:t>
+      </w:r>
+    </w:p>
+    <w:p>
+      <w:r>
+        <w:t xml:space="preserve">To respond directly to the reviewer comment that Llama 3 should be justified against another model, an additional comparison was carried out on </w:t>
+      </w:r>
+      <w:r>
+        <w:rPr>
+          <w:b/>
+        </w:rPr>
+        <w:t>21 March 2026</w:t>
+      </w:r>
+      <w:r>
+        <w:t>. Two comparison styles were used.</w:t>
+      </w:r>
+    </w:p>
+    <w:p>
+      <w:r>
+        <w:t xml:space="preserve">The first was a </w:t>
+      </w:r>
+      <w:r>
+        <w:rPr>
+          <w:b/>
+        </w:rPr>
+        <w:t>controlled prompt comparison</w:t>
+      </w:r>
+      <w:r>
+        <w:t xml:space="preserve"> using fixed market snapshots injected directly into the response layer. This removed API noise and allowed the two local models to be compared against the same input data. Four cases were tested: Bitcoin price in Pro mode, Ethereum price in Simple mode, Aave TVL in Pro mode, and Uniswap TVL in Pro mode. The results were written to </w:t>
+      </w:r>
+      <w:r>
+        <w:rPr>
+          <w:rFonts w:ascii="Courier New" w:hAnsi="Courier New"/>
+        </w:rPr>
+        <w:t>evaluation_outputs/llm_prompt_comparison.csv</w:t>
+      </w:r>
+      <w:r>
+        <w:t>.</w:t>
+      </w:r>
+    </w:p>
+    <w:p>
+      <w:r>
+        <w:t>The controlled comparison produced the following summary:</w:t>
+      </w:r>
+    </w:p>
+    <w:p>
+      <w:pPr>
+        <w:pStyle w:val="ListBullet"/>
+      </w:pPr>
+      <w:r>
+        <w:rPr>
+          <w:rFonts w:ascii="Courier New" w:hAnsi="Courier New"/>
+        </w:rPr>
+        <w:t>llama3</w:t>
+      </w:r>
+      <w:r>
+        <w:t xml:space="preserve">: average response stage </w:t>
+      </w:r>
+      <w:r>
+        <w:rPr>
+          <w:b/>
+        </w:rPr>
+        <w:t>2521.36 ms</w:t>
+      </w:r>
+      <w:r>
+        <w:t xml:space="preserve">, </w:t>
+      </w:r>
+      <w:r>
+        <w:rPr>
+          <w:b/>
+        </w:rPr>
+        <w:t>0/4</w:t>
+      </w:r>
+      <w:r>
+        <w:t xml:space="preserve"> direct Ollama acceptances, </w:t>
+      </w:r>
+      <w:r>
+        <w:rPr>
+          <w:b/>
+        </w:rPr>
+        <w:t>4/4</w:t>
+      </w:r>
+      <w:r>
+        <w:t xml:space="preserve"> final replies preserved the expected live value</w:t>
+      </w:r>
+    </w:p>
+    <w:p>
+      <w:pPr>
+        <w:pStyle w:val="ListBullet"/>
+      </w:pPr>
+      <w:r>
+        <w:rPr>
+          <w:rFonts w:ascii="Courier New" w:hAnsi="Courier New"/>
+        </w:rPr>
+        <w:t>qwen2.5:3b</w:t>
+      </w:r>
+      <w:r>
+        <w:t xml:space="preserve">: average response stage </w:t>
+      </w:r>
+      <w:r>
+        <w:rPr>
+          <w:b/>
+        </w:rPr>
+        <w:t>2977.76 ms</w:t>
+      </w:r>
+      <w:r>
+        <w:t xml:space="preserve">, </w:t>
+      </w:r>
+      <w:r>
+        <w:rPr>
+          <w:b/>
+        </w:rPr>
+        <w:t>1/4</w:t>
+      </w:r>
+      <w:r>
+        <w:t xml:space="preserve"> direct Ollama acceptances, </w:t>
+      </w:r>
+      <w:r>
+        <w:rPr>
+          <w:b/>
+        </w:rPr>
+        <w:t>4/4</w:t>
+      </w:r>
+      <w:r>
+        <w:t xml:space="preserve"> final replies preserved the expected live value</w:t>
+      </w:r>
+    </w:p>
+    <w:p>
+      <w:r>
+        <w:t xml:space="preserve">This result shows two useful points. First, Alfred's guardrail and fallback mechanism worked as intended for both models because the final user-facing reply still retained the injected live value in every controlled case. Second, </w:t>
+      </w:r>
+      <w:r>
+        <w:rPr>
+          <w:rFonts w:ascii="Courier New" w:hAnsi="Courier New"/>
+        </w:rPr>
+        <w:t>qwen2.5:3b</w:t>
+      </w:r>
+      <w:r>
+        <w:t xml:space="preserve"> did not provide a clear quality or speed advantage over </w:t>
+      </w:r>
+      <w:r>
+        <w:rPr>
+          <w:rFonts w:ascii="Courier New" w:hAnsi="Courier New"/>
+        </w:rPr>
+        <w:t>llama3</w:t>
+      </w:r>
+      <w:r>
+        <w:t xml:space="preserve"> in this project setting. Although Qwen passed the guardrail once where Llama 3 did not, its average response time in the controlled run was higher because of one slower Pro-mode case.</w:t>
+      </w:r>
+    </w:p>
+    <w:p>
+      <w:r>
+        <w:t xml:space="preserve">The second comparison was a </w:t>
+      </w:r>
+      <w:r>
+        <w:rPr>
+          <w:b/>
+        </w:rPr>
+        <w:t>live end-to-end batch</w:t>
+      </w:r>
+      <w:r>
+        <w:t xml:space="preserve"> through the full Flask application using six prompts. The results were written to </w:t>
+      </w:r>
+      <w:r>
+        <w:rPr>
+          <w:rFonts w:ascii="Courier New" w:hAnsi="Courier New"/>
+        </w:rPr>
+        <w:t>evaluation_outputs/model_comparison_results.csv</w:t>
+      </w:r>
+      <w:r>
+        <w:t xml:space="preserve">. In that live batch, </w:t>
+      </w:r>
+      <w:r>
+        <w:rPr>
+          <w:rFonts w:ascii="Courier New" w:hAnsi="Courier New"/>
+        </w:rPr>
+        <w:t>llama3</w:t>
+      </w:r>
+      <w:r>
+        <w:t xml:space="preserve"> recorded an average total response time of </w:t>
+      </w:r>
+      <w:r>
+        <w:rPr>
+          <w:b/>
+        </w:rPr>
+        <w:t>3826.06 ms</w:t>
+      </w:r>
+      <w:r>
+        <w:t xml:space="preserve">, compared with </w:t>
+      </w:r>
+      <w:r>
+        <w:rPr>
+          <w:b/>
+        </w:rPr>
+        <w:t>4103.82 ms</w:t>
+      </w:r>
+      <w:r>
+        <w:t xml:space="preserve"> for </w:t>
+      </w:r>
+      <w:r>
+        <w:rPr>
+          <w:rFonts w:ascii="Courier New" w:hAnsi="Courier New"/>
+        </w:rPr>
+        <w:t>qwen2.5:3b</w:t>
+      </w:r>
+      <w:r>
+        <w:t xml:space="preserve">. The corresponding final-reply value retention rates were </w:t>
+      </w:r>
+      <w:r>
+        <w:rPr>
+          <w:b/>
+        </w:rPr>
+        <w:t>66.67%</w:t>
+      </w:r>
+      <w:r>
+        <w:t xml:space="preserve"> for </w:t>
+      </w:r>
+      <w:r>
+        <w:rPr>
+          <w:rFonts w:ascii="Courier New" w:hAnsi="Courier New"/>
+        </w:rPr>
+        <w:t>llama3</w:t>
+      </w:r>
+      <w:r>
+        <w:t xml:space="preserve"> and </w:t>
+      </w:r>
+      <w:r>
+        <w:rPr>
+          <w:b/>
+        </w:rPr>
+        <w:t>33.33%</w:t>
+      </w:r>
+      <w:r>
+        <w:t xml:space="preserve"> for </w:t>
+      </w:r>
+      <w:r>
+        <w:rPr>
+          <w:rFonts w:ascii="Courier New" w:hAnsi="Courier New"/>
+        </w:rPr>
+        <w:t>qwen2.5:3b</w:t>
+      </w:r>
+      <w:r>
+        <w:t>. However, these live figures were partly affected by repeated upstream API calls that occasionally returned missing price values, so they should be treated as supplementary rather than the main basis of model selection.</w:t>
+      </w:r>
+    </w:p>
+    <w:p>
+      <w:r>
+        <w:t xml:space="preserve">Taken together, the comparison supports a moderate conclusion rather than an absolute one. </w:t>
+      </w:r>
+      <w:r>
+        <w:rPr>
+          <w:rFonts w:ascii="Courier New" w:hAnsi="Courier New"/>
+        </w:rPr>
+        <w:t>llama3</w:t>
+      </w:r>
+      <w:r>
+        <w:t xml:space="preserve"> was not chosen because it is universally the best open model. It was chosen because, within Alfred's local undergraduate project scope, it gave a slightly better end-to-end fit across latency, local tooling support, and overall stability during development. The comparison with Qwen therefore strengthens the justification for Llama 3 while also showing that Alfred's safety layer is more important than the raw model alone.</w:t>
+      </w:r>
+    </w:p>
+    <w:p>
+      <w:r>
+        <w:drawing>
+          <wp:inline xmlns:a="http://schemas.openxmlformats.org/drawingml/2006/main" xmlns:pic="http://schemas.openxmlformats.org/drawingml/2006/picture">
+            <wp:extent cx="5943600" cy="3566160"/>
+            <wp:docPr id="1" name="Picture 1"/>
+            <wp:cNvGraphicFramePr>
+              <a:graphicFrameLocks noChangeAspect="1"/>
+            </wp:cNvGraphicFramePr>
+            <a:graphic>
+              <a:graphicData uri="http://schemas.openxmlformats.org/drawingml/2006/picture">
+                <pic:pic>
+                  <pic:nvPicPr>
+                    <pic:cNvPr id="0" name="model_comparison.png"/>
+                    <pic:cNvPicPr/>
+                  </pic:nvPicPr>
+                  <pic:blipFill>
+                    <a:blip r:embed="rId9"/>
+                    <a:stretch>
+                      <a:fillRect/>
+                    </a:stretch>
+                  </pic:blipFill>
+                  <pic:spPr>
+                    <a:xfrm>
+                      <a:off x="0" y="0"/>
+                      <a:ext cx="5943600" cy="3566160"/>
+                    </a:xfrm>
+                    <a:prstGeom prst="rect"/>
+                  </pic:spPr>
+                </pic:pic>
+              </a:graphicData>
+            </a:graphic>
+          </wp:inline>
+        </w:drawing>
+      </w:r>
+    </w:p>
+    <w:p>
+      <w:pPr>
+        <w:jc w:val="center"/>
+      </w:pPr>
+      <w:r>
+        <w:t>Figure 5.1. Controlled and live local-model comparison used to justify the final Llama 3 deployment choice.</w:t>
+      </w:r>
+    </w:p>
+    <w:p>
+      <w:pPr>
+        <w:pStyle w:val="Heading3"/>
+      </w:pPr>
+      <w:r>
+        <w:t>5.2.5 Edge Cases and Failure Handling</w:t>
       </w:r>
     </w:p>
     <w:p>
@@ -3781,7 +4141,7 @@
     </w:p>
     <w:p>
       <w:r>
-        <w:t>For Research Question 3, the latency measurements show that a local Ollama-based architecture is feasible on the project machine. Even with the response guard in place, the tested prompt set remained comfortably below the 10-second threshold.</w:t>
+        <w:t>For Research Question 3, the latency measurements show that a local Ollama-based architecture is feasible on the project machine. Even with the response guard in place, the tested prompt set remained comfortably below the 10-second threshold. The additional model comparison also showed that swapping to a smaller alternative model did not automatically produce a better outcome, which supports the decision to optimise the overall pipeline rather than chase model changes alone.</w:t>
       </w:r>
     </w:p>
     <w:p>
@@ -3798,7 +4158,7 @@
     </w:p>
     <w:p>
       <w:r>
-        <w:t>This evaluation has several limitations. First, the technical verification batches were small and focused on the project's supported intents. Second, the user study section still requires final participant data to be inserted. Third, the system depends on third-party APIs, which may change over time or return incomplete values. Fourth, the current implementation focuses on a constrained set of questions rather than the full space of cryptocurrency information needs.</w:t>
+        <w:t>This evaluation has several limitations. First, the technical verification batches were small and focused on the project's supported intents. Second, the user study section still requires final participant data to be inserted. Third, the system depends on third-party APIs, which may change over time or return incomplete values. Fourth, the current implementation focuses on a constrained set of questions rather than the full space of cryptocurrency information needs. Fifth, the live model-comparison batch was partly affected by repeated API requests, which is why the controlled prompt comparison should be treated as the fairer direct comparison between models.</w:t>
       </w:r>
     </w:p>
     <w:p>
@@ -3917,70 +4277,47 @@
       </w:r>
     </w:p>
     <w:p>
-      <w:pPr>
-        <w:pStyle w:val="NoSpacing"/>
-      </w:pPr>
-      <w:r>
-        <w:rPr>
-          <w:rFonts w:ascii="Courier New" w:hAnsi="Courier New"/>
-          <w:sz w:val="17"/>
-        </w:rPr>
-        <w:t>gantt</w:t>
-        <w:br/>
-        <w:t xml:space="preserve">    title Alfred Project Plan</w:t>
-        <w:br/>
-        <w:t xml:space="preserve">    dateFormat  YYYY-MM-DD</w:t>
-        <w:br/>
-        <w:t xml:space="preserve">    axisFormat  %d %b</w:t>
-        <w:br/>
-        <w:br/>
-        <w:t xml:space="preserve">    section Planning</w:t>
-        <w:br/>
-        <w:t xml:space="preserve">    Project proposal and topic definition     :done, p1, 2025-10-01, 2025-10-21</w:t>
-        <w:br/>
-        <w:t xml:space="preserve">    Literature collection and reading         :done, p2, 2025-10-22, 2025-11-20</w:t>
-        <w:br/>
-        <w:t xml:space="preserve">    Draft literature review                   :done, p3, 2025-11-21, 2025-12-05</w:t>
-        <w:br/>
-        <w:br/>
-        <w:t xml:space="preserve">    section Design</w:t>
-        <w:br/>
-        <w:t xml:space="preserve">    Architecture and user-mode design         :done, d1, 2025-11-25, 2025-12-10</w:t>
-        <w:br/>
-        <w:t xml:space="preserve">    Preliminary report preparation            :done, d2, 2025-12-01, 2025-12-18</w:t>
-        <w:br/>
-        <w:br/>
-        <w:t xml:space="preserve">    section Implementation</w:t>
-        <w:br/>
-        <w:t xml:space="preserve">    Flask backend scaffold                    :active, i1, 2026-03-19, 2026-03-22</w:t>
-        <w:br/>
-        <w:t xml:space="preserve">    Regex intent parser                       :active, i2, 2026-03-19, 2026-03-22</w:t>
-        <w:br/>
-        <w:t xml:space="preserve">    CoinGecko and DefiLlama integration       :active, i3, 2026-03-20, 2026-03-23</w:t>
-        <w:br/>
-        <w:t xml:space="preserve">    Ollama integration and prompt tuning      :active, i4, 2026-03-20, 2026-03-24</w:t>
-        <w:br/>
-        <w:t xml:space="preserve">    Frontend UI and mode switching            :active, i5, 2026-03-20, 2026-03-25</w:t>
-        <w:br/>
-        <w:br/>
-        <w:t xml:space="preserve">    section Testing and Evaluation</w:t>
-        <w:br/>
-        <w:t xml:space="preserve">    Unit testing and edge-case checks         :i6, 2026-03-23, 2026-03-26</w:t>
-        <w:br/>
-        <w:t xml:space="preserve">    Latency measurement runs                  :i7, 2026-03-24, 2026-03-27</w:t>
-        <w:br/>
-        <w:t xml:space="preserve">    Novice and expert user testing            :i8, 2026-03-24, 2026-03-30</w:t>
-        <w:br/>
-        <w:t xml:space="preserve">    Evaluation chapter write-up               :i9, 2026-03-27, 2026-03-31</w:t>
-        <w:br/>
-        <w:br/>
-        <w:t xml:space="preserve">    section Final Submission</w:t>
-        <w:br/>
-        <w:t xml:space="preserve">    Final report editing                      :f1, 2026-03-28, 2026-04-03</w:t>
-        <w:br/>
-        <w:t xml:space="preserve">    Demo video recording                      :f2, 2026-03-31, 2026-04-03</w:t>
-        <w:br/>
-        <w:t xml:space="preserve">    Final checks and submission               :f3, 2026-04-03, 2026-04-05</w:t>
+      <w:r>
+        <w:drawing>
+          <wp:inline xmlns:a="http://schemas.openxmlformats.org/drawingml/2006/main" xmlns:pic="http://schemas.openxmlformats.org/drawingml/2006/picture">
+            <wp:extent cx="5943600" cy="3426311"/>
+            <wp:docPr id="2" name="Picture 2"/>
+            <wp:cNvGraphicFramePr>
+              <a:graphicFrameLocks noChangeAspect="1"/>
+            </wp:cNvGraphicFramePr>
+            <a:graphic>
+              <a:graphicData uri="http://schemas.openxmlformats.org/drawingml/2006/picture">
+                <pic:pic>
+                  <pic:nvPicPr>
+                    <pic:cNvPr id="0" name="gantt_chart.png"/>
+                    <pic:cNvPicPr/>
+                  </pic:nvPicPr>
+                  <pic:blipFill>
+                    <a:blip r:embed="rId10"/>
+                    <a:stretch>
+                      <a:fillRect/>
+                    </a:stretch>
+                  </pic:blipFill>
+                  <pic:spPr>
+                    <a:xfrm>
+                      <a:off x="0" y="0"/>
+                      <a:ext cx="5943600" cy="3426311"/>
+                    </a:xfrm>
+                    <a:prstGeom prst="rect"/>
+                  </pic:spPr>
+                </pic:pic>
+              </a:graphicData>
+            </a:graphic>
+          </wp:inline>
+        </w:drawing>
+      </w:r>
+    </w:p>
+    <w:p>
+      <w:pPr>
+        <w:jc w:val="center"/>
+      </w:pPr>
+      <w:r>
+        <w:t>Appendix Figure A1. Gantt chart showing the major planning, implementation, evaluation, and submission tasks for Alfred.</w:t>
       </w:r>
     </w:p>
     <w:p>
@@ -4277,7 +4614,54 @@
         <w:rPr>
           <w:rFonts w:ascii="Courier New" w:hAnsi="Courier New"/>
         </w:rPr>
+        <w:t>evaluation_outputs/llm_prompt_comparison.csv</w:t>
+      </w:r>
+    </w:p>
+    <w:p>
+      <w:pPr>
+        <w:pStyle w:val="ListBullet"/>
+      </w:pPr>
+      <w:r>
+        <w:rPr>
+          <w:rFonts w:ascii="Courier New" w:hAnsi="Courier New"/>
+        </w:rPr>
+        <w:t>evaluation_outputs/model_comparison_results.csv</w:t>
+      </w:r>
+    </w:p>
+    <w:p>
+      <w:pPr>
+        <w:pStyle w:val="ListBullet"/>
+      </w:pPr>
+      <w:r>
+        <w:rPr>
+          <w:rFonts w:ascii="Courier New" w:hAnsi="Courier New"/>
+        </w:rPr>
         <w:t>logs/alfred_requests.jsonl</w:t>
+      </w:r>
+    </w:p>
+    <w:p>
+      <w:pPr>
+        <w:jc w:val="center"/>
+      </w:pPr>
+      <w:r>
+        <w:rPr>
+          <w:rFonts w:ascii="Inter" w:hAnsi="Inter"/>
+          <w:sz w:val="22"/>
+        </w:rPr>
+        <w:t>Appendix E: Public Code Repository</w:t>
+      </w:r>
+    </w:p>
+    <w:p>
+      <w:r>
+        <w:t>The public code repository for Alfred is available at:</w:t>
+      </w:r>
+    </w:p>
+    <w:p>
+      <w:r>
+        <w:rPr>
+          <w:rFonts w:ascii="Courier New" w:hAnsi="Courier New"/>
+        </w:rPr>
+        <w:t>https://github.com/kohjunhao/alfred-crypto-ai-companion</w:t>
       </w:r>
     </w:p>
     <w:p>
@@ -4389,6 +4773,38 @@
       </w:pPr>
       <w:r>
         <w:t>TRM Labs (2026) *The 2026 Crypto Crime Report*.</w:t>
+      </w:r>
+    </w:p>
+    <w:p>
+      <w:pPr>
+        <w:pStyle w:val="ListNumber"/>
+      </w:pPr>
+      <w:r>
+        <w:t>Lee, J., Stevens, N., Han, S.C. and Song, M. (2024) 'A Survey of Large Language Models in Finance (FinLLMs)', *arXiv preprint* arXiv:2402.02315.</w:t>
+      </w:r>
+    </w:p>
+    <w:p>
+      <w:pPr>
+        <w:pStyle w:val="ListNumber"/>
+      </w:pPr>
+      <w:r>
+        <w:t>Sharma, C. (2025) 'Retrieval-Augmented Generation: A Comprehensive Survey of Architectures, Enhancements, and Robustness Frontiers', *arXiv preprint* arXiv:2506.00054.</w:t>
+      </w:r>
+    </w:p>
+    <w:p>
+      <w:pPr>
+        <w:pStyle w:val="ListNumber"/>
+      </w:pPr>
+      <w:r>
+        <w:t>Grattafiori, A. et al. (2024) 'The Llama 3 Herd of Models', *arXiv preprint* arXiv:2407.21783.</w:t>
+      </w:r>
+    </w:p>
+    <w:p>
+      <w:pPr>
+        <w:pStyle w:val="ListNumber"/>
+      </w:pPr>
+      <w:r>
+        <w:t>Qwen Team (2024) 'Qwen2.5 Technical Report', *arXiv preprint* arXiv:2412.15115.</w:t>
       </w:r>
     </w:p>
     <w:sectPr>

</xml_diff>